<commit_message>
Cleanup: retain single master combined document and remove redundant per-section reports and archive artifacts. Removed intermediate per-section Word files from docs/ leaving only pneumatic_launcher_analysis_complete.docx as canonical master. Deleted prior timestamped dump and zip files used for interim backups since repository versioning with Git is now the canonical backup. Updated repository contents to reduce clutter and ensure single source of generated documentation. This simplifies downstream consumption, CI artifact selection, and prevents accidental editing of stale copies. No analysis data was altered; outputs remain in outputs/ for traceability.
</commit_message>
<xml_diff>
--- a/docs/pneumatic_launcher_analysis_complete.docx
+++ b/docs/pneumatic_launcher_analysis_complete.docx
@@ -2927,42 +2927,42 @@
     </w:p>
     <w:p>
       <w:r>
-        <w:t>C:\Users\BBBS-AI-01\d\uav_neutralisation\pneumatic_launcher_analysis.docx</w:t>
+        <w:t>C:\Users\BBBS-AI-01\d\uav_neutralisation\docs\pneumatic_launcher_analysis.docx</w:t>
       </w:r>
     </w:p>
     <w:p>
       <w:r>
-        <w:t>C:\Users\BBBS-AI-01\d\uav_neutralisation\pneumatic_launcher_analysis_structural.docx</w:t>
+        <w:t>C:\Users\BBBS-AI-01\d\uav_neutralisation\docs\pneumatic_launcher_analysis_structural.docx</w:t>
       </w:r>
     </w:p>
     <w:p>
       <w:r>
-        <w:t>C:\Users\BBBS-AI-01\d\uav_neutralisation\pneumatic_launcher_analysis_transient.docx</w:t>
+        <w:t>C:\Users\BBBS-AI-01\d\uav_neutralisation\docs\pneumatic_launcher_analysis_transient.docx</w:t>
       </w:r>
     </w:p>
     <w:p>
       <w:r>
-        <w:t>C:\Users\BBBS-AI-01\d\uav_neutralisation\pneumatic_launcher_analysis_final.docx</w:t>
+        <w:t>C:\Users\BBBS-AI-01\d\uav_neutralisation\docs\pneumatic_launcher_analysis_final.docx</w:t>
       </w:r>
     </w:p>
     <w:p>
       <w:r>
-        <w:t>C:\Users\BBBS-AI-01\d\uav_neutralisation\parametric_sweep.csv</w:t>
+        <w:t>C:\Users\BBBS-AI-01\d\uav_neutralisation\outputs\parametric_sweep.csv</w:t>
       </w:r>
     </w:p>
     <w:p>
       <w:r>
-        <w:t>C:\Users\BBBS-AI-01\d\uav_neutralisation\parametric_sweep_summary.json</w:t>
+        <w:t>C:\Users\BBBS-AI-01\d\uav_neutralisation\outputs\parametric_sweep_summary.json</w:t>
       </w:r>
     </w:p>
     <w:p>
       <w:r>
-        <w:t>C:\Users\BBBS-AI-01\d\uav_neutralisation\flange_check.json</w:t>
+        <w:t>C:\Users\BBBS-AI-01\d\uav_neutralisation\outputs\flange_check.json</w:t>
       </w:r>
     </w:p>
     <w:p>
       <w:r>
-        <w:t>C:\Users\BBBS-AI-01\d\uav_neutralisation\analysis_summary.json</w:t>
+        <w:t>C:\Users\BBBS-AI-01\d\uav_neutralisation\outputs\analysis_summary.json</w:t>
       </w:r>
     </w:p>
     <w:sectPr>

</xml_diff>

<commit_message>
Update generation timestamp in pneumatic launcher analysis documentation
</commit_message>
<xml_diff>
--- a/docs/pneumatic_launcher_analysis_complete.docx
+++ b/docs/pneumatic_launcher_analysis_complete.docx
@@ -3996,316 +3996,6 @@
         </w:tc>
       </w:tr>
     </w:tbl>
-    <w:p>
-      <w:pPr>
-        <w:pStyle w:val="Heading1"/>
-      </w:pPr>
-      <w:r>
-        <w:t>Appendix: Generated Files</w:t>
-      </w:r>
-    </w:p>
-    <w:tbl>
-      <w:tblPr>
-        <w:tblW w:type="auto" w:w="0"/>
-        <w:tblLook w:firstColumn="1" w:firstRow="1" w:lastColumn="0" w:lastRow="0" w:noHBand="0" w:noVBand="1" w:val="04A0"/>
-      </w:tblPr>
-      <w:tblGrid>
-        <w:gridCol w:w="8640"/>
-      </w:tblGrid>
-      <w:tr>
-        <w:tc>
-          <w:tcPr>
-            <w:tcW w:type="dxa" w:w="8640"/>
-          </w:tcPr>
-          <w:p>
-            <w:r>
-              <w:t>Generated outputs</w:t>
-            </w:r>
-          </w:p>
-        </w:tc>
-      </w:tr>
-      <w:tr>
-        <w:tc>
-          <w:tcPr>
-            <w:tcW w:type="dxa" w:w="8640"/>
-          </w:tcPr>
-          <w:p>
-            <w:r>
-              <w:t>outputs\analysis_summary.json</w:t>
-            </w:r>
-          </w:p>
-        </w:tc>
-      </w:tr>
-      <w:tr>
-        <w:tc>
-          <w:tcPr>
-            <w:tcW w:type="dxa" w:w="8640"/>
-          </w:tcPr>
-          <w:p>
-            <w:r>
-              <w:t>outputs\dimensions_measured.csv</w:t>
-            </w:r>
-          </w:p>
-        </w:tc>
-      </w:tr>
-      <w:tr>
-        <w:tc>
-          <w:tcPr>
-            <w:tcW w:type="dxa" w:w="8640"/>
-          </w:tcPr>
-          <w:p>
-            <w:r>
-              <w:t>outputs\flange_check.json</w:t>
-            </w:r>
-          </w:p>
-        </w:tc>
-      </w:tr>
-      <w:tr>
-        <w:tc>
-          <w:tcPr>
-            <w:tcW w:type="dxa" w:w="8640"/>
-          </w:tcPr>
-          <w:p>
-            <w:r>
-              <w:t>outputs\impulse_vs_orifice_Vc_1000uL.png</w:t>
-            </w:r>
-          </w:p>
-        </w:tc>
-      </w:tr>
-      <w:tr>
-        <w:tc>
-          <w:tcPr>
-            <w:tcW w:type="dxa" w:w="8640"/>
-          </w:tcPr>
-          <w:p>
-            <w:r>
-              <w:t>outputs\launcher_drawing.dxf</w:t>
-            </w:r>
-          </w:p>
-        </w:tc>
-      </w:tr>
-      <w:tr>
-        <w:tc>
-          <w:tcPr>
-            <w:tcW w:type="dxa" w:w="8640"/>
-          </w:tcPr>
-          <w:p>
-            <w:r>
-              <w:t>outputs\launcher_drawing.png</w:t>
-            </w:r>
-          </w:p>
-        </w:tc>
-      </w:tr>
-      <w:tr>
-        <w:tc>
-          <w:tcPr>
-            <w:tcW w:type="dxa" w:w="8640"/>
-          </w:tcPr>
-          <w:p>
-            <w:r>
-              <w:t>outputs\launcher_drawing.svg</w:t>
-            </w:r>
-          </w:p>
-        </w:tc>
-      </w:tr>
-      <w:tr>
-        <w:tc>
-          <w:tcPr>
-            <w:tcW w:type="dxa" w:w="8640"/>
-          </w:tcPr>
-          <w:p>
-            <w:r>
-              <w:t>outputs\launcher_drawing_preview.png</w:t>
-            </w:r>
-          </w:p>
-        </w:tc>
-      </w:tr>
-      <w:tr>
-        <w:tc>
-          <w:tcPr>
-            <w:tcW w:type="dxa" w:w="8640"/>
-          </w:tcPr>
-          <w:p>
-            <w:r>
-              <w:t>outputs\launcher_geometry.json</w:t>
-            </w:r>
-          </w:p>
-        </w:tc>
-      </w:tr>
-      <w:tr>
-        <w:tc>
-          <w:tcPr>
-            <w:tcW w:type="dxa" w:w="8640"/>
-          </w:tcPr>
-          <w:p>
-            <w:r>
-              <w:t>outputs\launcher_side_view.png</w:t>
-            </w:r>
-          </w:p>
-        </w:tc>
-      </w:tr>
-      <w:tr>
-        <w:tc>
-          <w:tcPr>
-            <w:tcW w:type="dxa" w:w="8640"/>
-          </w:tcPr>
-          <w:p>
-            <w:r>
-              <w:t>outputs\launcher_side_view.svg</w:t>
-            </w:r>
-          </w:p>
-        </w:tc>
-      </w:tr>
-      <w:tr>
-        <w:tc>
-          <w:tcPr>
-            <w:tcW w:type="dxa" w:w="8640"/>
-          </w:tcPr>
-          <w:p>
-            <w:r>
-              <w:t>outputs\launcher_top_view.png</w:t>
-            </w:r>
-          </w:p>
-        </w:tc>
-      </w:tr>
-      <w:tr>
-        <w:tc>
-          <w:tcPr>
-            <w:tcW w:type="dxa" w:w="8640"/>
-          </w:tcPr>
-          <w:p>
-            <w:r>
-              <w:t>outputs\launcher_top_view.svg</w:t>
-            </w:r>
-          </w:p>
-        </w:tc>
-      </w:tr>
-      <w:tr>
-        <w:tc>
-          <w:tcPr>
-            <w:tcW w:type="dxa" w:w="8640"/>
-          </w:tcPr>
-          <w:p>
-            <w:r>
-              <w:t>outputs\parametric_sweep.csv</w:t>
-            </w:r>
-          </w:p>
-        </w:tc>
-      </w:tr>
-      <w:tr>
-        <w:tc>
-          <w:tcPr>
-            <w:tcW w:type="dxa" w:w="8640"/>
-          </w:tcPr>
-          <w:p>
-            <w:r>
-              <w:t>outputs\parametric_sweep_summary.json</w:t>
-            </w:r>
-          </w:p>
-        </w:tc>
-      </w:tr>
-      <w:tr>
-        <w:tc>
-          <w:tcPr>
-            <w:tcW w:type="dxa" w:w="8640"/>
-          </w:tcPr>
-          <w:p>
-            <w:r>
-              <w:t>outputs\peakF_vs_orifice_Vc_1000uL.png</w:t>
-            </w:r>
-          </w:p>
-        </w:tc>
-      </w:tr>
-      <w:tr>
-        <w:tc>
-          <w:tcPr>
-            <w:tcW w:type="dxa" w:w="8640"/>
-          </w:tcPr>
-          <w:p>
-            <w:r>
-              <w:t>outputs\pneumatic_launcher_analysis.md</w:t>
-            </w:r>
-          </w:p>
-        </w:tc>
-      </w:tr>
-      <w:tr>
-        <w:tc>
-          <w:tcPr>
-            <w:tcW w:type="dxa" w:w="8640"/>
-          </w:tcPr>
-          <w:p>
-            <w:r>
-              <w:t>outputs\top_view_and_side_view.png</w:t>
-            </w:r>
-          </w:p>
-        </w:tc>
-      </w:tr>
-      <w:tr>
-        <w:tc>
-          <w:tcPr>
-            <w:tcW w:type="dxa" w:w="8640"/>
-          </w:tcPr>
-          <w:p>
-            <w:r>
-              <w:t>outputs\top_view_measured.png</w:t>
-            </w:r>
-          </w:p>
-        </w:tc>
-      </w:tr>
-      <w:tr>
-        <w:tc>
-          <w:tcPr>
-            <w:tcW w:type="dxa" w:w="8640"/>
-          </w:tcPr>
-          <w:p>
-            <w:r>
-              <w:t>outputs\vel_vs_orifice_Vc_1000uL.png</w:t>
-            </w:r>
-          </w:p>
-        </w:tc>
-      </w:tr>
-      <w:tr>
-        <w:tc>
-          <w:tcPr>
-            <w:tcW w:type="dxa" w:w="8640"/>
-          </w:tcPr>
-          <w:p>
-            <w:r>
-              <w:t>outputs\vel_vs_orifice_Vc_1200uL.png</w:t>
-            </w:r>
-          </w:p>
-        </w:tc>
-      </w:tr>
-      <w:tr>
-        <w:tc>
-          <w:tcPr>
-            <w:tcW w:type="dxa" w:w="8640"/>
-          </w:tcPr>
-          <w:p>
-            <w:r>
-              <w:t>outputs\vel_vs_orifice_Vc_500uL.png</w:t>
-            </w:r>
-          </w:p>
-        </w:tc>
-      </w:tr>
-      <w:tr>
-        <w:tc>
-          <w:tcPr>
-            <w:tcW w:type="dxa" w:w="8640"/>
-          </w:tcPr>
-          <w:p>
-            <w:r>
-              <w:t>outputs\vel_vs_orifice_Vc_800uL.png</w:t>
-            </w:r>
-          </w:p>
-        </w:tc>
-      </w:tr>
-    </w:tbl>
-    <w:p>
-      <w:r>
-        <w:t>docs\pneumatic_launcher_analysis_complete.docx</w:t>
-      </w:r>
-    </w:p>
     <w:p>
       <w:pPr>
         <w:pStyle w:val="Heading1"/>

</xml_diff>